<commit_message>
add repo link to report
</commit_message>
<xml_diff>
--- a/1.docx
+++ b/1.docx
@@ -961,7 +961,7 @@
                     </pic:cNvPicPr>
                   </pic:nvPicPr>
                   <pic:blipFill>
-                    <a:blip r:embed="rId4"/>
+                    <a:blip r:embed="rId5"/>
                     <a:stretch>
                       <a:fillRect/>
                     </a:stretch>
@@ -1696,7 +1696,7 @@
                     <pic:cNvPicPr/>
                   </pic:nvPicPr>
                   <pic:blipFill>
-                    <a:blip r:embed="rId5"/>
+                    <a:blip r:embed="rId6"/>
                     <a:stretch>
                       <a:fillRect/>
                     </a:stretch>
@@ -2130,7 +2130,7 @@
                     </pic:cNvPicPr>
                   </pic:nvPicPr>
                   <pic:blipFill>
-                    <a:blip r:embed="rId6"/>
+                    <a:blip r:embed="rId7"/>
                     <a:stretch>
                       <a:fillRect/>
                     </a:stretch>
@@ -2487,7 +2487,7 @@
                     </pic:cNvPicPr>
                   </pic:nvPicPr>
                   <pic:blipFill>
-                    <a:blip r:embed="rId7"/>
+                    <a:blip r:embed="rId8"/>
                     <a:stretch>
                       <a:fillRect/>
                     </a:stretch>
@@ -2983,7 +2983,7 @@
                     </pic:cNvPicPr>
                   </pic:nvPicPr>
                   <pic:blipFill>
-                    <a:blip r:embed="rId8"/>
+                    <a:blip r:embed="rId9"/>
                     <a:stretch>
                       <a:fillRect/>
                     </a:stretch>
@@ -3214,7 +3214,7 @@
                     </pic:cNvPicPr>
                   </pic:nvPicPr>
                   <pic:blipFill>
-                    <a:blip r:embed="rId9"/>
+                    <a:blip r:embed="rId10"/>
                     <a:stretch>
                       <a:fillRect/>
                     </a:stretch>
@@ -3274,7 +3274,7 @@
                     </pic:cNvPicPr>
                   </pic:nvPicPr>
                   <pic:blipFill>
-                    <a:blip r:embed="rId10"/>
+                    <a:blip r:embed="rId11"/>
                     <a:stretch>
                       <a:fillRect/>
                     </a:stretch>
@@ -3679,7 +3679,7 @@
                     </pic:cNvPicPr>
                   </pic:nvPicPr>
                   <pic:blipFill>
-                    <a:blip r:embed="rId11"/>
+                    <a:blip r:embed="rId12"/>
                     <a:stretch>
                       <a:fillRect/>
                     </a:stretch>
@@ -3985,7 +3985,7 @@
                     </pic:cNvPicPr>
                   </pic:nvPicPr>
                   <pic:blipFill>
-                    <a:blip r:embed="rId12"/>
+                    <a:blip r:embed="rId13"/>
                     <a:stretch>
                       <a:fillRect/>
                     </a:stretch>
@@ -4319,7 +4319,7 @@
                     </pic:cNvPicPr>
                   </pic:nvPicPr>
                   <pic:blipFill>
-                    <a:blip r:embed="rId13"/>
+                    <a:blip r:embed="rId14"/>
                     <a:stretch>
                       <a:fillRect/>
                     </a:stretch>
@@ -4717,7 +4717,7 @@
                     <pic:cNvPicPr/>
                   </pic:nvPicPr>
                   <pic:blipFill>
-                    <a:blip r:embed="rId14"/>
+                    <a:blip r:embed="rId15"/>
                     <a:stretch>
                       <a:fillRect/>
                     </a:stretch>
@@ -4993,7 +4993,7 @@
                     <pic:cNvPicPr/>
                   </pic:nvPicPr>
                   <pic:blipFill>
-                    <a:blip r:embed="rId14"/>
+                    <a:blip r:embed="rId15"/>
                     <a:stretch>
                       <a:fillRect/>
                     </a:stretch>
@@ -5238,7 +5238,7 @@
                     <pic:cNvPicPr/>
                   </pic:nvPicPr>
                   <pic:blipFill>
-                    <a:blip r:embed="rId15"/>
+                    <a:blip r:embed="rId16"/>
                     <a:stretch>
                       <a:fillRect/>
                     </a:stretch>
@@ -5303,7 +5303,7 @@
                     <pic:cNvPicPr/>
                   </pic:nvPicPr>
                   <pic:blipFill>
-                    <a:blip r:embed="rId16"/>
+                    <a:blip r:embed="rId17"/>
                     <a:stretch>
                       <a:fillRect/>
                     </a:stretch>
@@ -5883,7 +5883,7 @@
                     <pic:cNvPicPr/>
                   </pic:nvPicPr>
                   <pic:blipFill>
-                    <a:blip r:embed="rId17"/>
+                    <a:blip r:embed="rId18"/>
                     <a:stretch>
                       <a:fillRect/>
                     </a:stretch>
@@ -6236,7 +6236,7 @@
                     </pic:cNvPicPr>
                   </pic:nvPicPr>
                   <pic:blipFill>
-                    <a:blip r:embed="rId18"/>
+                    <a:blip r:embed="rId19"/>
                     <a:stretch>
                       <a:fillRect/>
                     </a:stretch>
@@ -6512,7 +6512,7 @@
                     </pic:cNvPicPr>
                   </pic:nvPicPr>
                   <pic:blipFill>
-                    <a:blip r:embed="rId19"/>
+                    <a:blip r:embed="rId20"/>
                     <a:stretch>
                       <a:fillRect/>
                     </a:stretch>
@@ -6785,7 +6785,7 @@
                     </pic:cNvPicPr>
                   </pic:nvPicPr>
                   <pic:blipFill>
-                    <a:blip r:embed="rId20"/>
+                    <a:blip r:embed="rId21"/>
                     <a:stretch>
                       <a:fillRect/>
                     </a:stretch>
@@ -7364,7 +7364,7 @@
                     </pic:cNvPicPr>
                   </pic:nvPicPr>
                   <pic:blipFill>
-                    <a:blip r:embed="rId21"/>
+                    <a:blip r:embed="rId22"/>
                     <a:stretch>
                       <a:fillRect/>
                     </a:stretch>
@@ -7765,7 +7765,7 @@
                     <pic:cNvPicPr/>
                   </pic:nvPicPr>
                   <pic:blipFill>
-                    <a:blip r:embed="rId22"/>
+                    <a:blip r:embed="rId23"/>
                     <a:stretch>
                       <a:fillRect/>
                     </a:stretch>
@@ -7789,11 +7789,50 @@
     <w:p>
       <w:pPr>
         <w:spacing w:before="300" w:after="100" w:afterAutospacing="1" w:line="240" w:lineRule="auto"/>
+        <w:jc w:val="center"/>
         <w:outlineLvl w:val="2"/>
         <w:rPr>
-          <w:lang w:val="en-US"/>
-        </w:rPr>
-      </w:pPr>
+          <w:rFonts w:ascii="Times New Roman" w:eastAsia="Times New Roman" w:hAnsi="Times New Roman" w:cs="Times New Roman"/>
+          <w:b/>
+          <w:bCs/>
+          <w:color w:val="000000"/>
+          <w:kern w:val="0"/>
+          <w:sz w:val="28"/>
+          <w:szCs w:val="28"/>
+          <w:lang w:eastAsia="ru-RU"/>
+          <w14:ligatures w14:val="none"/>
+        </w:rPr>
+      </w:pPr>
+      <w:r>
+        <w:rPr>
+          <w:rFonts w:ascii="Times New Roman" w:eastAsia="Times New Roman" w:hAnsi="Times New Roman" w:cs="Times New Roman"/>
+          <w:b/>
+          <w:bCs/>
+          <w:color w:val="000000"/>
+          <w:kern w:val="0"/>
+          <w:sz w:val="28"/>
+          <w:szCs w:val="28"/>
+          <w:lang w:eastAsia="ru-RU"/>
+          <w14:ligatures w14:val="none"/>
+        </w:rPr>
+        <w:t xml:space="preserve">Ссылка на репозиторий: </w:t>
+      </w:r>
+      <w:hyperlink r:id="rId24" w:history="1">
+        <w:r>
+          <w:rPr>
+            <w:rStyle w:val="ac"/>
+            <w:rFonts w:ascii="Times New Roman" w:eastAsia="Times New Roman" w:hAnsi="Times New Roman" w:cs="Times New Roman"/>
+            <w:b/>
+            <w:bCs/>
+            <w:kern w:val="0"/>
+            <w:sz w:val="28"/>
+            <w:szCs w:val="28"/>
+            <w:lang w:eastAsia="ru-RU"/>
+            <w14:ligatures w14:val="none"/>
+          </w:rPr>
+          <w:t>https://github.com/thesadichh-gif/FinalWork.git</w:t>
+        </w:r>
+      </w:hyperlink>
     </w:p>
     <w:sectPr>
       <w:pgSz w:w="11906" w:h="16838"/>
@@ -8723,6 +8762,29 @@
       <w:spacing w:val="5"/>
     </w:rPr>
   </w:style>
+  <w:style w:type="character" w:styleId="ac">
+    <w:name w:val="Hyperlink"/>
+    <w:basedOn w:val="a0"/>
+    <w:uiPriority w:val="99"/>
+    <w:unhideWhenUsed/>
+    <w:rsid w:val="00FA79FA"/>
+    <w:rPr>
+      <w:color w:val="467886" w:themeColor="hyperlink"/>
+      <w:u w:val="single"/>
+    </w:rPr>
+  </w:style>
+  <w:style w:type="character" w:styleId="ad">
+    <w:name w:val="Unresolved Mention"/>
+    <w:basedOn w:val="a0"/>
+    <w:uiPriority w:val="99"/>
+    <w:semiHidden/>
+    <w:unhideWhenUsed/>
+    <w:rsid w:val="00FA79FA"/>
+    <w:rPr>
+      <w:color w:val="605E5C"/>
+      <w:shd w:val="clear" w:color="auto" w:fill="E1DFDD"/>
+    </w:rPr>
+  </w:style>
 </w:styles>
 </file>
 
@@ -9019,4 +9081,16 @@
     </a:ext>
   </a:extLst>
 </a:theme>
+</file>
+
+<file path=customXml/item1.xml><?xml version="1.0" encoding="utf-8"?>
+<b:Sources xmlns:b="http://schemas.openxmlformats.org/officeDocument/2006/bibliography" xmlns="http://schemas.openxmlformats.org/officeDocument/2006/bibliography" SelectedStyle="" StyleName="" Version="0"/>
+</file>
+
+<file path=customXml/itemProps1.xml><?xml version="1.0" encoding="utf-8"?>
+<ds:datastoreItem xmlns:ds="http://schemas.openxmlformats.org/officeDocument/2006/customXml" ds:itemID="{367AB732-CF89-4D50-A62F-E2B8BA2A4CD5}">
+  <ds:schemaRefs>
+    <ds:schemaRef ds:uri="http://schemas.openxmlformats.org/officeDocument/2006/bibliography"/>
+  </ds:schemaRefs>
+</ds:datastoreItem>
 </file>
</xml_diff>